<commit_message>
Add the IZA working paper on occupational segregation
"Preferences, Discrimination, and Occupational Segregation" (with Girish
Bahal and Jan Feld) is out as IZA Discussion Paper No. 18843, so the
project moves from work-in-progress to a published working paper.

- publications.html: new Working Papers entry linking to the IZA PDF
- research.html: drop the Ongoing Projects item, describe the paper and
  link it from the labour economics paragraph instead
- cv.docx / cv.pdf: new Working Papers entry, PDF regenerated

Co-Authored-By: Claude Opus 5 <noreply@anthropic.com>
</commit_message>
<xml_diff>
--- a/cv.docx
+++ b/cv.docx
@@ -2163,6 +2163,57 @@
         <w:t xml:space="preserve">, CEPR Discussion Paper, 2026 – </w:t>
       </w:r>
       <w:hyperlink r:id="rId27">
+        <w:r>
+          <w:rPr>
+            <w:rFonts w:ascii="Cambria" w:cs="Cambria" w:eastAsia="Cambria" w:hAnsi="Cambria"/>
+            <w:i w:val="1"/>
+            <w:iCs w:val="1"/>
+            <w:color w:val="0563c1"/>
+            <w:sz w:val="24"/>
+            <w:szCs w:val="24"/>
+            <w:u w:val="single"/>
+            <w:rtl w:val="0"/>
+          </w:rPr>
+          <w:t xml:space="preserve">link</w:t>
+        </w:r>
+      </w:hyperlink>
+    </w:p>
+    <w:p>
+      <w:pPr>
+        <w:spacing w:after="114" w:before="114" w:line="240" w:lineRule="auto"/>
+        <w:jc w:val="both"/>
+        <w:rPr>
+          <w:rFonts w:ascii="Cambria" w:cs="Cambria" w:eastAsia="Cambria" w:hAnsi="Cambria"/>
+          <w:sz w:val="24"/>
+          <w:szCs w:val="24"/>
+        </w:rPr>
+      </w:pPr>
+      <w:r>
+        <w:rPr>
+          <w:rFonts w:ascii="Cambria" w:hAnsi="Cambria" w:cs="Cambria"/>
+          <w:sz w:val="24"/>
+          <w:szCs w:val="24"/>
+        </w:rPr>
+        <w:t xml:space="preserve">‘Preferences, discrimination, and occupational segregation’</w:t>
+      </w:r>
+      <w:r>
+        <w:rPr>
+          <w:rFonts w:ascii="Cambria" w:hAnsi="Cambria" w:cs="Cambria"/>
+          <w:i/>
+          <w:sz w:val="24"/>
+          <w:szCs w:val="24"/>
+        </w:rPr>
+        <w:t xml:space="preserve"> with Girish Bahal and Jan Feld</w:t>
+      </w:r>
+      <w:r>
+        <w:rPr>
+          <w:rFonts w:ascii="Cambria" w:hAnsi="Cambria" w:cs="Cambria"/>
+          <w:sz w:val="24"/>
+          <w:szCs w:val="24"/>
+        </w:rPr>
+        <w:t xml:space="preserve">, IZA Discussion Paper, 2026 – </w:t>
+      </w:r>
+      <w:hyperlink r:id="rId29">
         <w:r>
           <w:rPr>
             <w:rFonts w:ascii="Cambria" w:cs="Cambria" w:eastAsia="Cambria" w:hAnsi="Cambria"/>

</xml_diff>